<commit_message>
1. Sitzung: Block zur Literatursuche; Kursbeschreibung aktualisiert
Co-Authored-By: Claude Opus 5.5 <noreply@anthropic.com>
Claude-Session: https://claude.ai/code/session_01VLCMYQ1mounEw5aFg6PJHq
</commit_message>
<xml_diff>
--- a/Kursbeschreibung.docx
+++ b/Kursbeschreibung.docx
@@ -383,7 +383,7 @@
           <w:rFonts w:cs="Cardo"/>
           <w:lang w:val="de-DE"/>
         </w:rPr>
-        <w:t xml:space="preserve">Die erste Sitzung führt in Python, reguläre Ausdrücke, APIs und GitHub ein. Ab der zweiten Sitzung leiten jeweils zwei Teilnehmende die Sitzung und stellen ihr Modul im jeweiligen Stand vor:</w:t>
+        <w:t xml:space="preserve">Die erste Sitzung führt in Python, reguläre Ausdrücke, APIs, GitHub und die Literatursuche ein. Ab der zweiten Sitzung leiten jeweils zwei Teilnehmende die Sitzung und stellen ihr Modul im jeweiligen Stand vor:</w:t>
       </w:r>
     </w:p>
     <w:p>
@@ -617,7 +617,7 @@
           <w:szCs w:val="20"/>
           <w:lang w:val="de-DE"/>
         </w:rPr>
-        <w:t xml:space="preserve">Was ist ein Programm? Variablen, Datentypen, Listen, Funktionen, Schleifen, Module. Reguläre Ausdrücke. APIs und JSON. Git und GitHub. Nach jedem Block eine Übung an Enūma eliš I 1–4; zum Schluss ein erstes Programm. Verteilung der Module.</w:t>
+        <w:t xml:space="preserve">Was ist ein Programm? Variablen, Datentypen, Listen, Funktionen, Schleifen, Module. Reguläre Ausdrücke. APIs und JSON. Git und GitHub. Literatur finden (Google Scholar, Semantic Scholar, ACL Anthology, KeiBi; Zotero). Nach jedem Block eine Übung, meist an Enūma eliš I 1–4; zum Schluss ein erstes Programm. Verteilung der Module.</w:t>
       </w:r>
     </w:p>
     <w:p>
@@ -712,7 +712,7 @@
           <w:szCs w:val="20"/>
           <w:lang w:val="de-DE"/>
         </w:rPr>
-        <w:t xml:space="preserve">Arbeiten mit einem KI-Assistenten (GitHub Copilot): Aufgaben formulieren, Code lesen, Ergebnisse prüfen. Die Daten von eBL und Oracc. Recherche jenseits der Altorientalistik (Google Scholar, Semantic Scholar, ACL Anthology); Zotero.</w:t>
+        <w:t xml:space="preserve">Arbeiten mit einem KI-Assistenten (GitHub Copilot): Aufgaben formulieren, Code lesen, Ergebnisse prüfen. Die Daten von eBL und Oracc.</w:t>
       </w:r>
     </w:p>
     <w:p>

</xml_diff>